<commit_message>
B1 Book 2: correct Fares's surname in the Units 17-21 answer keys
Nine sample bylines in the Units 17-21 answer keys read "F. Haddad".
Fares is Kayyali throughout both Student's Books and Book 1's keys, and
Haddad is Issam Haddad, a separate figure in the Unit 18 tracks. Corrected
to "F. Kayyali" and the five keys rebuilt; page counts unchanged
(31, 30, 30, 30, 31).

Co-Authored-By: Claude Opus 5 <noreply@anthropic.com>
Claude-Session: https://claude.ai/code/session_01Qyh7uRVsiebNero71esRN8
</commit_message>
<xml_diff>
--- a/proactive-english-b1-sy/out/PE-B1-BK2-SY_Unit17_AnswerKey.docx
+++ b/proactive-english-b1-sy/out/PE-B1-BK2-SY_Unit17_AnswerKey.docx
@@ -2228,7 +2228,7 @@
                 <w:sz w:val="22"/>
                 <w:szCs w:val="22"/>
               </w:rPr>
-              <w:t xml:space="preserve"> · F. Haddad · November</w:t>
+              <w:t xml:space="preserve"> · F. Kayyali · November</w:t>
             </w:r>
           </w:p>
           <w:p>
@@ -4470,7 +4470,7 @@
                 <w:sz w:val="22"/>
                 <w:szCs w:val="22"/>
               </w:rPr>
-              <w:t xml:space="preserve"> · F. Haddad · November</w:t>
+              <w:t xml:space="preserve"> · F. Kayyali · November</w:t>
             </w:r>
           </w:p>
           <w:p>
@@ -18121,7 +18121,7 @@
                 <w:sz w:val="22"/>
                 <w:szCs w:val="22"/>
               </w:rPr>
-              <w:t xml:space="preserve"> · F. Haddad · November</w:t>
+              <w:t xml:space="preserve"> · F. Kayyali · November</w:t>
             </w:r>
           </w:p>
           <w:p>

</xml_diff>